<commit_message>
Résumé: Whalor bullets match the product today; add Go and React Native to skills; new PDF
The PDF served here was an older March 16 export (monospace, Whalor described
as an options-flow platform on Convex/WebSockets). It is now generated from the
current résumé text, with Whalor described as it is: 0DTE setup alerts with the
exact contract, entry and targets, a Go + PostgreSQL backend, a React Native
iOS app with OTA updates, a React web app, published outcomes, and a
pre-registered backtesting pipeline.

Co-Authored-By: Claude Opus 5.5 <noreply@anthropic.com>
Claude-Session: https://claude.ai/code/session_01XbHeYiq2pS8KvjPezoDF3c
</commit_message>
<xml_diff>
--- a/public/zavion_resume_latest.docx
+++ b/public/zavion_resume_latest.docx
@@ -32,7 +32,7 @@
           <w:sz w:val="24"/>
           <w:sz-cs w:val="24"/>
         </w:rPr>
-        <w:t xml:space="preserve">zavionsherman.com | Phoenix, AZ</w:t>
+        <w:t xml:space="preserve">zavionsherman.com | Shermanzavion@gmail.com | Phoenix, AZ</w:t>
       </w:r>
     </w:p>
     <w:p>
@@ -65,7 +65,7 @@
           <w:sz w:val="24"/>
           <w:sz-cs w:val="24"/>
         </w:rPr>
-        <w:t xml:space="preserve">Senior full-stack engineer with 6+ years building SaaS and internal platforms across fintech and healthcare. Strong in React/Next.js, Node.js, .NET, SQL/Postgres, API architecture, and AI integrations. Known for shipping reliable products, improving performance/accessibility, and translating business goals into scalable software.</w:t>
+        <w:t xml:space="preserve">Senior Full-Stack Engineer with 6+ years delivering customer-facing and internal SaaS products in fintech and healthcare. Experienced across frontend architecture, backend/API integration, performance optimization, testing strategy, and production release quality using React, Next.js, Node.js, .NET, SQL/PostgreSQL, and AI-assisted development workflows.</w:t>
       </w:r>
     </w:p>
     <w:p>
@@ -98,7 +98,7 @@
           <w:sz w:val="24"/>
           <w:sz-cs w:val="24"/>
         </w:rPr>
-        <w:t xml:space="preserve">React, Next.js, TypeScript, JavaScript, Node.js, REST APIs, C#, .NET Core, SQL, PostgreSQL, Jest, React Testing Library, Accessibility (WCAG 2.1 AA), Performance Optimization, AI Integrations</w:t>
+        <w:t xml:space="preserve">React, Next.js, TypeScript, JavaScript, React Native, Node.js, Go, REST APIs, API Integration, Microservices, C#, .NET Core, SQL, PostgreSQL, Performance Optimization, Jest, React Testing Library, Agile/Scrum, WCAG 2.1 AA, AI-Assisted Development</w:t>
       </w:r>
     </w:p>
     <w:p>
@@ -142,73 +142,73 @@
           <w:sz w:val="24"/>
           <w:sz-cs w:val="24"/>
         </w:rPr>
-        <w:t xml:space="preserve">- Built and shipped onboarding/acquisition features across frontend and backend services for cardmember growth journeys.</w:t>
-      </w:r>
-    </w:p>
-    <w:p>
-      <w:pPr/>
-      <w:r>
-        <w:rPr>
-          <w:rFonts w:ascii="Helvetica Light" w:hAnsi="Helvetica Light" w:cs="Helvetica Light"/>
-          <w:sz w:val="24"/>
-          <w:sz-cs w:val="24"/>
-        </w:rPr>
-        <w:t xml:space="preserve">- Integrated REST APIs into customer-facing flows (application, identity/profile, and servicing touchpoints) with strong contract validation and error handling.</w:t>
-      </w:r>
-    </w:p>
-    <w:p>
-      <w:pPr/>
-      <w:r>
-        <w:rPr>
-          <w:rFonts w:ascii="Helvetica Light" w:hAnsi="Helvetica Light" w:cs="Helvetica Light"/>
-          <w:sz w:val="24"/>
-          <w:sz-cs w:val="24"/>
-        </w:rPr>
-        <w:t xml:space="preserve">- Implemented server/client data-fetching optimizations, code splitting, and lazy loading to improve perceived performance and reduce bundle weight.</w:t>
-      </w:r>
-    </w:p>
-    <w:p>
-      <w:pPr/>
-      <w:r>
-        <w:rPr>
-          <w:rFonts w:ascii="Helvetica Light" w:hAnsi="Helvetica Light" w:cs="Helvetica Light"/>
-          <w:sz w:val="24"/>
-          <w:sz-cs w:val="24"/>
-        </w:rPr>
-        <w:t xml:space="preserve">- Developed and maintained reusable React patterns plus API orchestration layers to speed delivery across multiple product squads.</w:t>
-      </w:r>
-    </w:p>
-    <w:p>
-      <w:pPr/>
-      <w:r>
-        <w:rPr>
-          <w:rFonts w:ascii="Helvetica Light" w:hAnsi="Helvetica Light" w:cs="Helvetica Light"/>
-          <w:sz w:val="24"/>
-          <w:sz-cs w:val="24"/>
-        </w:rPr>
-        <w:t xml:space="preserve">- Wrote unit/integration tests with Jest + React Testing Library and supported regression-hardening for high-traffic release windows.</w:t>
-      </w:r>
-    </w:p>
-    <w:p>
-      <w:pPr/>
-      <w:r>
-        <w:rPr>
-          <w:rFonts w:ascii="Helvetica Light" w:hAnsi="Helvetica Light" w:cs="Helvetica Light"/>
-          <w:sz w:val="24"/>
-          <w:sz-cs w:val="24"/>
-        </w:rPr>
-        <w:t xml:space="preserve">- Partnered with product, UX, and platform teams in Scrum to translate compliance-heavy banking requirements into scalable full-stack implementations.</w:t>
-      </w:r>
-    </w:p>
-    <w:p>
-      <w:pPr/>
-      <w:r>
-        <w:rPr>
-          <w:rFonts w:ascii="Helvetica Light" w:hAnsi="Helvetica Light" w:cs="Helvetica Light"/>
-          <w:sz w:val="24"/>
-          <w:sz-cs w:val="24"/>
-        </w:rPr>
-        <w:t xml:space="preserve">- Improved accessibility and responsive behavior for key customer journeys, aligning releases to WCAG 2.1 AA standards.</w:t>
+        <w:t xml:space="preserve">- Owned and shipped key cardmember onboarding journeys, including activation flow, registration flow, and account servicing flows (remove card and add account user experiences).</w:t>
+      </w:r>
+    </w:p>
+    <w:p>
+      <w:pPr/>
+      <w:r>
+        <w:rPr>
+          <w:rFonts w:ascii="Helvetica Light" w:hAnsi="Helvetica Light" w:cs="Helvetica Light"/>
+          <w:sz w:val="24"/>
+          <w:sz-cs w:val="24"/>
+        </w:rPr>
+        <w:t xml:space="preserve">- Built frontend + backend-integrated features for acquisition and servicing experiences, connecting UI states to secure REST APIs with robust validation and fallback handling.</w:t>
+      </w:r>
+    </w:p>
+    <w:p>
+      <w:pPr/>
+      <w:r>
+        <w:rPr>
+          <w:rFonts w:ascii="Helvetica Light" w:hAnsi="Helvetica Light" w:cs="Helvetica Light"/>
+          <w:sz w:val="24"/>
+          <w:sz-cs w:val="24"/>
+        </w:rPr>
+        <w:t xml:space="preserve">- Implemented API orchestration patterns to combine profile, eligibility, and account service responses into cohesive user flows with lower failure rates.</w:t>
+      </w:r>
+    </w:p>
+    <w:p>
+      <w:pPr/>
+      <w:r>
+        <w:rPr>
+          <w:rFonts w:ascii="Helvetica Light" w:hAnsi="Helvetica Light" w:cs="Helvetica Light"/>
+          <w:sz w:val="24"/>
+          <w:sz-cs w:val="24"/>
+        </w:rPr>
+        <w:t xml:space="preserve">- Applied performance optimizations (code splitting, lazy loading, smarter data-fetching strategies) to improve load speed and reduce client bundle impact.</w:t>
+      </w:r>
+    </w:p>
+    <w:p>
+      <w:pPr/>
+      <w:r>
+        <w:rPr>
+          <w:rFonts w:ascii="Helvetica Light" w:hAnsi="Helvetica Light" w:cs="Helvetica Light"/>
+          <w:sz w:val="24"/>
+          <w:sz-cs w:val="24"/>
+        </w:rPr>
+        <w:t xml:space="preserve">- Contributed to AI-assisted feature development workflows (prompt-driven generation, iteration, and validation) to accelerate delivery and improve implementation quality.</w:t>
+      </w:r>
+    </w:p>
+    <w:p>
+      <w:pPr/>
+      <w:r>
+        <w:rPr>
+          <w:rFonts w:ascii="Helvetica Light" w:hAnsi="Helvetica Light" w:cs="Helvetica Light"/>
+          <w:sz w:val="24"/>
+          <w:sz-cs w:val="24"/>
+        </w:rPr>
+        <w:t xml:space="preserve">- Wrote and maintained unit/integration coverage with Jest + React Testing Library for high-traffic releases and regression protection.</w:t>
+      </w:r>
+    </w:p>
+    <w:p>
+      <w:pPr/>
+      <w:r>
+        <w:rPr>
+          <w:rFonts w:ascii="Helvetica Light" w:hAnsi="Helvetica Light" w:cs="Helvetica Light"/>
+          <w:sz w:val="24"/>
+          <w:sz-cs w:val="24"/>
+        </w:rPr>
+        <w:t xml:space="preserve">- Partnered with product, design, and platform stakeholders to translate compliance-heavy banking requirements into production-ready full-stack solutions.</w:t>
       </w:r>
     </w:p>
     <w:p>
@@ -230,51 +230,84 @@
           <w:sz w:val="24"/>
           <w:sz-cs w:val="24"/>
         </w:rPr>
-        <w:t xml:space="preserve">Mid-Level Full-Stack Engineer (Consultant) — Tango | Aug 2021 - Sep 2022</w:t>
-      </w:r>
-    </w:p>
-    <w:p>
-      <w:pPr/>
-      <w:r>
-        <w:rPr>
-          <w:rFonts w:ascii="Helvetica Light" w:hAnsi="Helvetica Light" w:cs="Helvetica Light"/>
-          <w:sz w:val="24"/>
-          <w:sz-cs w:val="24"/>
-        </w:rPr>
-        <w:t xml:space="preserve">- Built Oasis using React, .NET Core, REST APIs, and SQL to replace manual paper-heavy operations with trackable digital workflows.</w:t>
-      </w:r>
-    </w:p>
-    <w:p>
-      <w:pPr/>
-      <w:r>
-        <w:rPr>
-          <w:rFonts w:ascii="Helvetica Light" w:hAnsi="Helvetica Light" w:cs="Helvetica Light"/>
-          <w:sz w:val="24"/>
-          <w:sz-cs w:val="24"/>
-        </w:rPr>
-        <w:t xml:space="preserve">- Delivered referral intake and submission capabilities across provider workflows, improving throughput and supporting measurable revenue impact.</w:t>
-      </w:r>
-    </w:p>
-    <w:p>
-      <w:pPr/>
-      <w:r>
-        <w:rPr>
-          <w:rFonts w:ascii="Helvetica Light" w:hAnsi="Helvetica Light" w:cs="Helvetica Light"/>
-          <w:sz w:val="24"/>
-          <w:sz-cs w:val="24"/>
-        </w:rPr>
-        <w:t xml:space="preserve">- Developed microservices and third-party API integrations to improve scalability, interoperability, and data consistency.</w:t>
-      </w:r>
-    </w:p>
-    <w:p>
-      <w:pPr/>
-      <w:r>
-        <w:rPr>
-          <w:rFonts w:ascii="Helvetica Light" w:hAnsi="Helvetica Light" w:cs="Helvetica Light"/>
-          <w:sz w:val="24"/>
-          <w:sz-cs w:val="24"/>
-        </w:rPr>
-        <w:t xml:space="preserve">- Led modernization efforts with TypeScript + React to improve maintainability and delivery speed.</w:t>
+        <w:t xml:space="preserve">Mid-Level Full-Stack Engineer (Consultant) — Tango (Home Healthcare) | Aug 2021 - Sep 2022</w:t>
+      </w:r>
+    </w:p>
+    <w:p>
+      <w:pPr/>
+      <w:r>
+        <w:rPr>
+          <w:rFonts w:ascii="Helvetica Light" w:hAnsi="Helvetica Light" w:cs="Helvetica Light"/>
+          <w:sz w:val="24"/>
+          <w:sz-cs w:val="24"/>
+        </w:rPr>
+        <w:t xml:space="preserve">- Built Oasis (Outcome and Assessment Information Set) workflows used in home healthcare operations to digitize critical patient-assessment documentation and reduce paper processes.</w:t>
+      </w:r>
+    </w:p>
+    <w:p>
+      <w:pPr/>
+      <w:r>
+        <w:rPr>
+          <w:rFonts w:ascii="Helvetica Light" w:hAnsi="Helvetica Light" w:cs="Helvetica Light"/>
+          <w:sz w:val="24"/>
+          <w:sz-cs w:val="24"/>
+        </w:rPr>
+        <w:t xml:space="preserve">- Developed provider-facing portal features that enabled teams to track patient visits, review care notes, and monitor key visit data in one operational system.</w:t>
+      </w:r>
+    </w:p>
+    <w:p>
+      <w:pPr/>
+      <w:r>
+        <w:rPr>
+          <w:rFonts w:ascii="Helvetica Light" w:hAnsi="Helvetica Light" w:cs="Helvetica Light"/>
+          <w:sz w:val="24"/>
+          <w:sz-cs w:val="24"/>
+        </w:rPr>
+        <w:t xml:space="preserve">- Implemented referral intake and submission experiences across provider workflows, improving throughput and supporting measurable revenue impact.</w:t>
+      </w:r>
+    </w:p>
+    <w:p>
+      <w:pPr/>
+      <w:r>
+        <w:rPr>
+          <w:rFonts w:ascii="Helvetica Light" w:hAnsi="Helvetica Light" w:cs="Helvetica Light"/>
+          <w:sz w:val="24"/>
+          <w:sz-cs w:val="24"/>
+        </w:rPr>
+        <w:t xml:space="preserve">- Built and integrated REST APIs + microservices to connect patient records, scheduling context, and visit documentation with reliable data flow across systems.</w:t>
+      </w:r>
+    </w:p>
+    <w:p>
+      <w:pPr/>
+      <w:r>
+        <w:rPr>
+          <w:rFonts w:ascii="Helvetica Light" w:hAnsi="Helvetica Light" w:cs="Helvetica Light"/>
+          <w:sz w:val="24"/>
+          <w:sz-cs w:val="24"/>
+        </w:rPr>
+        <w:t xml:space="preserve">- Improved role-based access and workflow routing so clinical and operational users could see the right patient information at the right step.</w:t>
+      </w:r>
+    </w:p>
+    <w:p>
+      <w:pPr/>
+      <w:r>
+        <w:rPr>
+          <w:rFonts w:ascii="Helvetica Light" w:hAnsi="Helvetica Light" w:cs="Helvetica Light"/>
+          <w:sz w:val="24"/>
+          <w:sz-cs w:val="24"/>
+        </w:rPr>
+        <w:t xml:space="preserve">- Integrated third-party services and modernized core UI modules with TypeScript + React to improve maintainability, performance, and release velocity.</w:t>
+      </w:r>
+    </w:p>
+    <w:p>
+      <w:pPr/>
+      <w:r>
+        <w:rPr>
+          <w:rFonts w:ascii="Helvetica Light" w:hAnsi="Helvetica Light" w:cs="Helvetica Light"/>
+          <w:sz w:val="24"/>
+          <w:sz-cs w:val="24"/>
+        </w:rPr>
+        <w:t xml:space="preserve">- Partnered with product and operations teams to translate home-health requirements into scalable, compliant software experiences.</w:t>
       </w:r>
     </w:p>
     <w:p>
@@ -384,40 +417,51 @@
           <w:sz w:val="24"/>
           <w:sz-cs w:val="24"/>
         </w:rPr>
-        <w:t xml:space="preserve">Tech: Expo, React Native, React, Vite, TypeScript, Convex, Clerk, Go (Fiber), WebSockets</w:t>
-      </w:r>
-    </w:p>
-    <w:p>
-      <w:pPr/>
-      <w:r>
-        <w:rPr>
-          <w:rFonts w:ascii="Helvetica Light" w:hAnsi="Helvetica Light" w:cs="Helvetica Light"/>
-          <w:sz w:val="24"/>
-          <w:sz-cs w:val="24"/>
-        </w:rPr>
-        <w:t xml:space="preserve">- Built an options flow platform spanning mobile app, web app, and backend services.</w:t>
-      </w:r>
-    </w:p>
-    <w:p>
-      <w:pPr/>
-      <w:r>
-        <w:rPr>
-          <w:rFonts w:ascii="Helvetica Light" w:hAnsi="Helvetica Light" w:cs="Helvetica Light"/>
-          <w:sz w:val="24"/>
-          <w:sz-cs w:val="24"/>
-        </w:rPr>
-        <w:t xml:space="preserve">- Implemented real-time unusual activity workflows and contextual signal presentation.</w:t>
-      </w:r>
-    </w:p>
-    <w:p>
-      <w:pPr/>
-      <w:r>
-        <w:rPr>
-          <w:rFonts w:ascii="Helvetica Light" w:hAnsi="Helvetica Light" w:cs="Helvetica Light"/>
-          <w:sz w:val="24"/>
-          <w:sz-cs w:val="24"/>
-        </w:rPr>
-        <w:t xml:space="preserve">- Designed scalable auth/data patterns and shipped production-grade cross-platform features.</w:t>
+        <w:t xml:space="preserve">Tech: React Native (Expo), TypeScript, React (Web), Go (Backend), PostgreSQL, Clerk Auth</w:t>
+      </w:r>
+    </w:p>
+    <w:p>
+      <w:pPr/>
+      <w:r>
+        <w:rPr>
+          <w:rFonts w:ascii="Helvetica Light" w:hAnsi="Helvetica Light" w:cs="Helvetica Light"/>
+          <w:sz w:val="24"/>
+          <w:sz-cs w:val="24"/>
+        </w:rPr>
+        <w:t xml:space="preserve">- Founded and built Whalor, a 0DTE options-alert product for iOS and web that detects same-day setups on SPY, QQQ, IWM, and selected liquid tickers in real time and delivers each one as a push alert with the exact contract, entry, and profit targets.</w:t>
+      </w:r>
+    </w:p>
+    <w:p>
+      <w:pPr/>
+      <w:r>
+        <w:rPr>
+          <w:rFonts w:ascii="Helvetica Light" w:hAnsi="Helvetica Light" w:cs="Helvetica Light"/>
+          <w:sz w:val="24"/>
+          <w:sz-cs w:val="24"/>
+        </w:rPr>
+        <w:t xml:space="preserve">- Built the Go backend (REST APIs, background workers, PostgreSQL) that streams market data, scans for setups, publishes alerts, and grades every alert's outcome, publishing wins and losses to a public record.</w:t>
+      </w:r>
+    </w:p>
+    <w:p>
+      <w:pPr/>
+      <w:r>
+        <w:rPr>
+          <w:rFonts w:ascii="Helvetica Light" w:hAnsi="Helvetica Light" w:cs="Helvetica Light"/>
+          <w:sz w:val="24"/>
+          <w:sz-cs w:val="24"/>
+        </w:rPr>
+        <w:t xml:space="preserve">- Shipped a React Native (Expo) iOS app with over-the-air updates and a React web app on one shared API, with Clerk authentication and user-scoped data access.</w:t>
+      </w:r>
+    </w:p>
+    <w:p>
+      <w:pPr/>
+      <w:r>
+        <w:rPr>
+          <w:rFonts w:ascii="Helvetica Light" w:hAnsi="Helvetica Light" w:cs="Helvetica Light"/>
+          <w:sz w:val="24"/>
+          <w:sz-cs w:val="24"/>
+        </w:rPr>
+        <w:t xml:space="preserve">- Built a research and backtesting pipeline that tests strategies and exits on historical options quote data, using pre-registered rules and train/holdout splits before anything goes live.</w:t>
       </w:r>
     </w:p>
     <w:p>
@@ -450,40 +494,51 @@
           <w:sz w:val="24"/>
           <w:sz-cs w:val="24"/>
         </w:rPr>
-        <w:t xml:space="preserve">Tech: Next.js, React, TypeScript, Tailwind, Prisma, Clerk, Stripe, PostHog, Expo</w:t>
-      </w:r>
-    </w:p>
-    <w:p>
-      <w:pPr/>
-      <w:r>
-        <w:rPr>
-          <w:rFonts w:ascii="Helvetica Light" w:hAnsi="Helvetica Light" w:cs="Helvetica Light"/>
-          <w:sz w:val="24"/>
-          <w:sz-cs w:val="24"/>
-        </w:rPr>
-        <w:t xml:space="preserve">- Built an e-signature/document workflow product with conversion-focused UX.</w:t>
-      </w:r>
-    </w:p>
-    <w:p>
-      <w:pPr/>
-      <w:r>
-        <w:rPr>
-          <w:rFonts w:ascii="Helvetica Light" w:hAnsi="Helvetica Light" w:cs="Helvetica Light"/>
-          <w:sz w:val="24"/>
-          <w:sz-cs w:val="24"/>
-        </w:rPr>
-        <w:t xml:space="preserve">- Integrated auth, billing, analytics, and AI-assisted document tooling.</w:t>
-      </w:r>
-    </w:p>
-    <w:p>
-      <w:pPr/>
-      <w:r>
-        <w:rPr>
-          <w:rFonts w:ascii="Helvetica Light" w:hAnsi="Helvetica Light" w:cs="Helvetica Light"/>
-          <w:sz w:val="24"/>
-          <w:sz-cs w:val="24"/>
-        </w:rPr>
-        <w:t xml:space="preserve">- Leading companion mobile app development for on-the-go document operations.</w:t>
+        <w:t xml:space="preserve">Tech: Next.js, React, TypeScript, PostgreSQL, Prisma, Clerk, Stripe, Expo (Mobile)</w:t>
+      </w:r>
+    </w:p>
+    <w:p>
+      <w:pPr/>
+      <w:r>
+        <w:rPr>
+          <w:rFonts w:ascii="Helvetica Light" w:hAnsi="Helvetica Light" w:cs="Helvetica Light"/>
+          <w:sz w:val="24"/>
+          <w:sz-cs w:val="24"/>
+        </w:rPr>
+        <w:t xml:space="preserve">- Built QuickSign as a web-first e-signature platform with a companion mobile application for on-the-go document actions.</w:t>
+      </w:r>
+    </w:p>
+    <w:p>
+      <w:pPr/>
+      <w:r>
+        <w:rPr>
+          <w:rFonts w:ascii="Helvetica Light" w:hAnsi="Helvetica Light" w:cs="Helvetica Light"/>
+          <w:sz w:val="24"/>
+          <w:sz-cs w:val="24"/>
+        </w:rPr>
+        <w:t xml:space="preserve">- Implemented end-to-end document lifecycle workflows, including drafting, signature routing, signer status tracking, and completion handling.</w:t>
+      </w:r>
+    </w:p>
+    <w:p>
+      <w:pPr/>
+      <w:r>
+        <w:rPr>
+          <w:rFonts w:ascii="Helvetica Light" w:hAnsi="Helvetica Light" w:cs="Helvetica Light"/>
+          <w:sz w:val="24"/>
+          <w:sz-cs w:val="24"/>
+        </w:rPr>
+        <w:t xml:space="preserve">- Integrated Clerk authentication, Stripe billing, and backend data models to support secure, auditable business workflows.</w:t>
+      </w:r>
+    </w:p>
+    <w:p>
+      <w:pPr/>
+      <w:r>
+        <w:rPr>
+          <w:rFonts w:ascii="Helvetica Light" w:hAnsi="Helvetica Light" w:cs="Helvetica Light"/>
+          <w:sz w:val="24"/>
+          <w:sz-cs w:val="24"/>
+        </w:rPr>
+        <w:t xml:space="preserve">- Shipped AI-assisted document tooling to reduce manual drafting time and improve workflow speed.</w:t>
       </w:r>
     </w:p>
     <w:p>
@@ -516,29 +571,51 @@
           <w:sz w:val="24"/>
           <w:sz-cs w:val="24"/>
         </w:rPr>
-        <w:t xml:space="preserve">Tech: Expo, React Native, TypeScript, Expo Router, Convex, Clerk, Stripe</w:t>
-      </w:r>
-    </w:p>
-    <w:p>
-      <w:pPr/>
-      <w:r>
-        <w:rPr>
-          <w:rFonts w:ascii="Helvetica Light" w:hAnsi="Helvetica Light" w:cs="Helvetica Light"/>
-          <w:sz w:val="24"/>
-          <w:sz-cs w:val="24"/>
-        </w:rPr>
-        <w:t xml:space="preserve">- Building a consistency-first fitness app focused on retention and daily habit adherence.</w:t>
-      </w:r>
-    </w:p>
-    <w:p>
-      <w:pPr/>
-      <w:r>
-        <w:rPr>
-          <w:rFonts w:ascii="Helvetica Light" w:hAnsi="Helvetica Light" w:cs="Helvetica Light"/>
-          <w:sz w:val="24"/>
-          <w:sz-cs w:val="24"/>
-        </w:rPr>
-        <w:t xml:space="preserve">- Designed low-friction onboarding and progress loops to increase repeat engagement.</w:t>
+        <w:t xml:space="preserve">Tech: React Native, Expo, TypeScript, PostgreSQL, Clerk, API Services</w:t>
+      </w:r>
+    </w:p>
+    <w:p>
+      <w:pPr/>
+      <w:r>
+        <w:rPr>
+          <w:rFonts w:ascii="Helvetica Light" w:hAnsi="Helvetica Light" w:cs="Helvetica Light"/>
+          <w:sz w:val="24"/>
+          <w:sz-cs w:val="24"/>
+        </w:rPr>
+        <w:t xml:space="preserve">- Built LEENR as a mobile-first fitness application focused on consistency, adherence, and low-friction daily tracking.</w:t>
+      </w:r>
+    </w:p>
+    <w:p>
+      <w:pPr/>
+      <w:r>
+        <w:rPr>
+          <w:rFonts w:ascii="Helvetica Light" w:hAnsi="Helvetica Light" w:cs="Helvetica Light"/>
+          <w:sz w:val="24"/>
+          <w:sz-cs w:val="24"/>
+        </w:rPr>
+        <w:t xml:space="preserve">- Implemented check-in, progress, and habit-loop features that help users track workouts and health behaviors over time.</w:t>
+      </w:r>
+    </w:p>
+    <w:p>
+      <w:pPr/>
+      <w:r>
+        <w:rPr>
+          <w:rFonts w:ascii="Helvetica Light" w:hAnsi="Helvetica Light" w:cs="Helvetica Light"/>
+          <w:sz w:val="24"/>
+          <w:sz-cs w:val="24"/>
+        </w:rPr>
+        <w:t xml:space="preserve">- Designed secure auth and synced data experiences for personalized, reliable user sessions.</w:t>
+      </w:r>
+    </w:p>
+    <w:p>
+      <w:pPr/>
+      <w:r>
+        <w:rPr>
+          <w:rFonts w:ascii="Helvetica Light" w:hAnsi="Helvetica Light" w:cs="Helvetica Light"/>
+          <w:sz w:val="24"/>
+          <w:sz-cs w:val="24"/>
+        </w:rPr>
+        <w:t xml:space="preserve">- Iterated onboarding and retention-focused UX flows to improve repeat engagement and long-term usage.</w:t>
       </w:r>
     </w:p>
     <w:sectPr/>

</xml_diff>